<commit_message>
Fill in Invictus USDOT and MC numbers in the parties block
Replaces the broker authority placeholder with USDOT 4490702 and
MC 1775070 in the English and Spanish columns of both the short and
full forms, and drops that item from the README fill-in list.

Co-Authored-By: Claude Opus 5 <noreply@anthropic.com>
Claude-Session: https://claude.ai/code/session_01NLxLMXDitwMpJ29gjsagVC
</commit_message>
<xml_diff>
--- a/docs/contracts/Invictus-Broker-Carrier-Agreement-EN-ES.docx
+++ b/docs/contracts/Invictus-Broker-Carrier-Agreement-EN-ES.docx
@@ -323,7 +323,55 @@
                 <w:sz w:val="20"/>
                 <w:szCs w:val="20"/>
               </w:rPr>
-              <w:t xml:space="preserve">, a [STATE] limited liability company, USDOT/MC Broker Authority No. ____________, with its principal place of business at [ADDRESS] ("</w:t>
+              <w:t xml:space="preserve">, a [STATE] limited liability company, USDOT No. </w:t>
+            </w:r>
+            <w:r>
+              <w:rPr>
+                <w:rFonts w:ascii="Times New Roman" w:cs="Times New Roman" w:eastAsia="Times New Roman" w:hAnsi="Times New Roman"/>
+                <w:b/>
+                <w:bCs/>
+                <w:i w:val="false"/>
+                <w:iCs w:val="false"/>
+                <w:sz w:val="20"/>
+                <w:szCs w:val="20"/>
+              </w:rPr>
+              <w:t xml:space="preserve">4490702</w:t>
+            </w:r>
+            <w:r>
+              <w:rPr>
+                <w:rFonts w:ascii="Times New Roman" w:cs="Times New Roman" w:eastAsia="Times New Roman" w:hAnsi="Times New Roman"/>
+                <w:b w:val="false"/>
+                <w:bCs w:val="false"/>
+                <w:i w:val="false"/>
+                <w:iCs w:val="false"/>
+                <w:sz w:val="20"/>
+                <w:szCs w:val="20"/>
+              </w:rPr>
+              <w:t xml:space="preserve">, MC No. </w:t>
+            </w:r>
+            <w:r>
+              <w:rPr>
+                <w:rFonts w:ascii="Times New Roman" w:cs="Times New Roman" w:eastAsia="Times New Roman" w:hAnsi="Times New Roman"/>
+                <w:b/>
+                <w:bCs/>
+                <w:i w:val="false"/>
+                <w:iCs w:val="false"/>
+                <w:sz w:val="20"/>
+                <w:szCs w:val="20"/>
+              </w:rPr>
+              <w:t xml:space="preserve">1775070</w:t>
+            </w:r>
+            <w:r>
+              <w:rPr>
+                <w:rFonts w:ascii="Times New Roman" w:cs="Times New Roman" w:eastAsia="Times New Roman" w:hAnsi="Times New Roman"/>
+                <w:b w:val="false"/>
+                <w:bCs w:val="false"/>
+                <w:i w:val="false"/>
+                <w:iCs w:val="false"/>
+                <w:sz w:val="20"/>
+                <w:szCs w:val="20"/>
+              </w:rPr>
+              <w:t xml:space="preserve">, with its principal place of business at [ADDRESS] ("</w:t>
             </w:r>
             <w:r>
               <w:rPr>
@@ -600,7 +648,55 @@
                 <w:sz w:val="20"/>
                 <w:szCs w:val="20"/>
               </w:rPr>
-              <w:t xml:space="preserve">, sociedad de responsabilidad limitada de [ESTADO], con Autoridad de Broker USDOT/MC N.º ____________ y domicilio principal en [DOMICILIO] (el "</w:t>
+              <w:t xml:space="preserve">, sociedad de responsabilidad limitada de [ESTADO], USDOT N.º </w:t>
+            </w:r>
+            <w:r>
+              <w:rPr>
+                <w:rFonts w:ascii="Times New Roman" w:cs="Times New Roman" w:eastAsia="Times New Roman" w:hAnsi="Times New Roman"/>
+                <w:b/>
+                <w:bCs/>
+                <w:i w:val="false"/>
+                <w:iCs w:val="false"/>
+                <w:sz w:val="20"/>
+                <w:szCs w:val="20"/>
+              </w:rPr>
+              <w:t xml:space="preserve">4490702</w:t>
+            </w:r>
+            <w:r>
+              <w:rPr>
+                <w:rFonts w:ascii="Times New Roman" w:cs="Times New Roman" w:eastAsia="Times New Roman" w:hAnsi="Times New Roman"/>
+                <w:b w:val="false"/>
+                <w:bCs w:val="false"/>
+                <w:i w:val="false"/>
+                <w:iCs w:val="false"/>
+                <w:sz w:val="20"/>
+                <w:szCs w:val="20"/>
+              </w:rPr>
+              <w:t xml:space="preserve">, MC N.º </w:t>
+            </w:r>
+            <w:r>
+              <w:rPr>
+                <w:rFonts w:ascii="Times New Roman" w:cs="Times New Roman" w:eastAsia="Times New Roman" w:hAnsi="Times New Roman"/>
+                <w:b/>
+                <w:bCs/>
+                <w:i w:val="false"/>
+                <w:iCs w:val="false"/>
+                <w:sz w:val="20"/>
+                <w:szCs w:val="20"/>
+              </w:rPr>
+              <w:t xml:space="preserve">1775070</w:t>
+            </w:r>
+            <w:r>
+              <w:rPr>
+                <w:rFonts w:ascii="Times New Roman" w:cs="Times New Roman" w:eastAsia="Times New Roman" w:hAnsi="Times New Roman"/>
+                <w:b w:val="false"/>
+                <w:bCs w:val="false"/>
+                <w:i w:val="false"/>
+                <w:iCs w:val="false"/>
+                <w:sz w:val="20"/>
+                <w:szCs w:val="20"/>
+              </w:rPr>
+              <w:t xml:space="preserve">, con domicilio principal en [DOMICILIO] (el "</w:t>
             </w:r>
             <w:r>
               <w:rPr>

</xml_diff>